<commit_message>
Dodan alternativni tok za rezervaciju vlasnika i male izmjene u 4. i 5. slucaju
</commit_message>
<xml_diff>
--- a/Dokumentacija/Scenariji slučajeva upotrebe ParkirajBa.docx
+++ b/Dokumentacija/Scenariji slučajeva upotrebe ParkirajBa.docx
@@ -12008,6 +12008,504 @@
     </w:p>
     <w:p>
       <w:pPr>
+        <w:pStyle w:val="Heading3s"/>
+      </w:pPr>
+      <w:r>
+        <w:t>[4.1.1] Alternativni tok – Vlasnik pristupa svom parkingu</w:t>
+      </w:r>
+    </w:p>
+    <w:tbl>
+      <w:tblPr>
+        <w:tblW w:w="0" w:type="auto"/>
+        <w:tblInd w:w="38" w:type="dxa"/>
+        <w:tblBorders>
+          <w:top w:val="single" w:sz="6" w:space="0" w:color="000000" w:themeColor="text1"/>
+          <w:left w:val="single" w:sz="6" w:space="0" w:color="000000" w:themeColor="text1"/>
+          <w:bottom w:val="single" w:sz="6" w:space="0" w:color="000000" w:themeColor="text1"/>
+          <w:right w:val="single" w:sz="6" w:space="0" w:color="000000" w:themeColor="text1"/>
+          <w:insideH w:val="single" w:sz="6" w:space="0" w:color="000000" w:themeColor="text1"/>
+          <w:insideV w:val="single" w:sz="6" w:space="0" w:color="000000" w:themeColor="text1"/>
+        </w:tblBorders>
+        <w:tblLayout w:type="fixed"/>
+        <w:tblCellMar>
+          <w:left w:w="0" w:type="dxa"/>
+          <w:right w:w="0" w:type="dxa"/>
+        </w:tblCellMar>
+        <w:tblLook w:val="01E0"/>
+      </w:tblPr>
+      <w:tblGrid>
+        <w:gridCol w:w="4675"/>
+        <w:gridCol w:w="4238"/>
+      </w:tblGrid>
+      <w:tr>
+        <w:trPr>
+          <w:trHeight w:val="571"/>
+        </w:trPr>
+        <w:tc>
+          <w:tcPr>
+            <w:tcW w:w="4675" w:type="dxa"/>
+            <w:tcBorders>
+              <w:bottom w:val="single" w:sz="4" w:space="0" w:color="BEBEBE"/>
+              <w:right w:val="single" w:sz="4" w:space="0" w:color="BEBEBE"/>
+            </w:tcBorders>
+            <w:shd w:val="clear" w:color="auto" w:fill="F1F1F1"/>
+          </w:tcPr>
+          <w:p>
+            <w:pPr>
+              <w:pStyle w:val="TableParagraph"/>
+              <w:spacing w:before="146"/>
+              <w:ind w:left="18"/>
+              <w:jc w:val="center"/>
+              <w:rPr>
+                <w:b/>
+                <w:bCs/>
+                <w:i/>
+                <w:iCs/>
+                <w:sz w:val="24"/>
+                <w:szCs w:val="24"/>
+              </w:rPr>
+            </w:pPr>
+            <w:r>
+              <w:rPr>
+                <w:b/>
+                <w:bCs/>
+                <w:i/>
+                <w:iCs/>
+                <w:spacing w:val="-2"/>
+                <w:sz w:val="24"/>
+                <w:szCs w:val="24"/>
+              </w:rPr>
+              <w:t>Korisnik (</w:t>
+            </w:r>
+            <w:r>
+              <w:rPr>
+                <w:b/>
+                <w:bCs/>
+                <w:i/>
+                <w:iCs/>
+                <w:spacing w:val="-2"/>
+                <w:sz w:val="24"/>
+                <w:szCs w:val="24"/>
+              </w:rPr>
+              <w:t>Vlasnik parkinga</w:t>
+            </w:r>
+            <w:r>
+              <w:rPr>
+                <w:b/>
+                <w:bCs/>
+                <w:i/>
+                <w:iCs/>
+                <w:spacing w:val="-2"/>
+                <w:sz w:val="24"/>
+                <w:szCs w:val="24"/>
+              </w:rPr>
+              <w:t>)</w:t>
+            </w:r>
+          </w:p>
+        </w:tc>
+        <w:tc>
+          <w:tcPr>
+            <w:tcW w:w="4238" w:type="dxa"/>
+            <w:tcBorders>
+              <w:left w:val="single" w:sz="4" w:space="0" w:color="BEBEBE"/>
+              <w:bottom w:val="single" w:sz="4" w:space="0" w:color="BEBEBE"/>
+            </w:tcBorders>
+            <w:shd w:val="clear" w:color="auto" w:fill="F1F1F1"/>
+          </w:tcPr>
+          <w:p>
+            <w:pPr>
+              <w:pStyle w:val="TableParagraph"/>
+              <w:spacing w:before="146"/>
+              <w:ind w:left="13"/>
+              <w:jc w:val="center"/>
+              <w:rPr>
+                <w:b/>
+                <w:i/>
+                <w:sz w:val="24"/>
+              </w:rPr>
+            </w:pPr>
+            <w:r>
+              <w:rPr>
+                <w:b/>
+                <w:i/>
+                <w:spacing w:val="-2"/>
+                <w:sz w:val="24"/>
+              </w:rPr>
+              <w:t>Sistem</w:t>
+            </w:r>
+          </w:p>
+        </w:tc>
+      </w:tr>
+      <w:tr>
+        <w:trPr>
+          <w:trHeight w:val="565"/>
+        </w:trPr>
+        <w:tc>
+          <w:tcPr>
+            <w:tcW w:w="4675" w:type="dxa"/>
+            <w:tcBorders>
+              <w:top w:val="single" w:sz="4" w:space="0" w:color="BEBEBE"/>
+              <w:bottom w:val="single" w:sz="4" w:space="0" w:color="BEBEBE"/>
+              <w:right w:val="single" w:sz="4" w:space="0" w:color="BEBEBE"/>
+            </w:tcBorders>
+          </w:tcPr>
+          <w:p>
+            <w:pPr>
+              <w:pStyle w:val="TableParagraph"/>
+              <w:numPr>
+                <w:ilvl w:val="0"/>
+                <w:numId w:val="39"/>
+              </w:numPr>
+              <w:spacing w:before="135"/>
+              <w:rPr>
+                <w:sz w:val="24"/>
+                <w:szCs w:val="24"/>
+              </w:rPr>
+            </w:pPr>
+            <w:r>
+              <w:rPr>
+                <w:sz w:val="24"/>
+                <w:szCs w:val="24"/>
+              </w:rPr>
+              <w:t>Vlasnik trazi pristup/rezervaciju na svom parkingu</w:t>
+            </w:r>
+          </w:p>
+        </w:tc>
+        <w:tc>
+          <w:tcPr>
+            <w:tcW w:w="4238" w:type="dxa"/>
+            <w:tcBorders>
+              <w:top w:val="single" w:sz="4" w:space="0" w:color="BEBEBE"/>
+              <w:left w:val="single" w:sz="4" w:space="0" w:color="BEBEBE"/>
+              <w:bottom w:val="single" w:sz="4" w:space="0" w:color="BEBEBE"/>
+            </w:tcBorders>
+          </w:tcPr>
+          <w:p>
+            <w:pPr>
+              <w:pStyle w:val="TableParagraph"/>
+              <w:ind w:left="827"/>
+              <w:jc w:val="both"/>
+              <w:rPr>
+                <w:sz w:val="24"/>
+                <w:szCs w:val="24"/>
+              </w:rPr>
+            </w:pPr>
+          </w:p>
+        </w:tc>
+      </w:tr>
+      <w:tr>
+        <w:trPr>
+          <w:trHeight w:val="565"/>
+        </w:trPr>
+        <w:tc>
+          <w:tcPr>
+            <w:tcW w:w="4675" w:type="dxa"/>
+            <w:tcBorders>
+              <w:top w:val="single" w:sz="4" w:space="0" w:color="BEBEBE"/>
+              <w:bottom w:val="single" w:sz="4" w:space="0" w:color="BEBEBE"/>
+              <w:right w:val="single" w:sz="4" w:space="0" w:color="BEBEBE"/>
+            </w:tcBorders>
+          </w:tcPr>
+          <w:p>
+            <w:pPr>
+              <w:pStyle w:val="TableParagraph"/>
+              <w:spacing w:before="135"/>
+              <w:ind w:left="1654"/>
+              <w:rPr>
+                <w:sz w:val="24"/>
+                <w:szCs w:val="24"/>
+              </w:rPr>
+            </w:pPr>
+          </w:p>
+        </w:tc>
+        <w:tc>
+          <w:tcPr>
+            <w:tcW w:w="4238" w:type="dxa"/>
+            <w:tcBorders>
+              <w:top w:val="single" w:sz="4" w:space="0" w:color="BEBEBE"/>
+              <w:left w:val="single" w:sz="4" w:space="0" w:color="BEBEBE"/>
+              <w:bottom w:val="single" w:sz="4" w:space="0" w:color="BEBEBE"/>
+            </w:tcBorders>
+          </w:tcPr>
+          <w:p>
+            <w:pPr>
+              <w:pStyle w:val="TableParagraph"/>
+              <w:numPr>
+                <w:ilvl w:val="0"/>
+                <w:numId w:val="39"/>
+              </w:numPr>
+              <w:rPr>
+                <w:sz w:val="24"/>
+                <w:szCs w:val="24"/>
+              </w:rPr>
+            </w:pPr>
+            <w:r>
+              <w:rPr>
+                <w:sz w:val="24"/>
+                <w:szCs w:val="24"/>
+              </w:rPr>
+              <w:t>Sistem provjerava u bazi podataka da li je to korisnikov parking</w:t>
+            </w:r>
+          </w:p>
+        </w:tc>
+      </w:tr>
+      <w:tr>
+        <w:trPr>
+          <w:trHeight w:val="565"/>
+        </w:trPr>
+        <w:tc>
+          <w:tcPr>
+            <w:tcW w:w="4675" w:type="dxa"/>
+            <w:tcBorders>
+              <w:top w:val="single" w:sz="4" w:space="0" w:color="BEBEBE"/>
+              <w:bottom w:val="single" w:sz="4" w:space="0" w:color="BEBEBE"/>
+              <w:right w:val="single" w:sz="4" w:space="0" w:color="BEBEBE"/>
+            </w:tcBorders>
+          </w:tcPr>
+          <w:p>
+            <w:pPr>
+              <w:pStyle w:val="TableParagraph"/>
+              <w:spacing w:before="135"/>
+              <w:ind w:left="1654"/>
+              <w:rPr>
+                <w:sz w:val="24"/>
+                <w:szCs w:val="24"/>
+              </w:rPr>
+            </w:pPr>
+          </w:p>
+        </w:tc>
+        <w:tc>
+          <w:tcPr>
+            <w:tcW w:w="4238" w:type="dxa"/>
+            <w:tcBorders>
+              <w:top w:val="single" w:sz="4" w:space="0" w:color="BEBEBE"/>
+              <w:left w:val="single" w:sz="4" w:space="0" w:color="BEBEBE"/>
+              <w:bottom w:val="single" w:sz="4" w:space="0" w:color="BEBEBE"/>
+            </w:tcBorders>
+          </w:tcPr>
+          <w:p>
+            <w:pPr>
+              <w:pStyle w:val="TableParagraph"/>
+              <w:numPr>
+                <w:ilvl w:val="0"/>
+                <w:numId w:val="39"/>
+              </w:numPr>
+              <w:rPr>
+                <w:sz w:val="24"/>
+                <w:szCs w:val="24"/>
+              </w:rPr>
+            </w:pPr>
+            <w:r>
+              <w:rPr>
+                <w:sz w:val="24"/>
+                <w:szCs w:val="24"/>
+              </w:rPr>
+              <w:t>U slučaju da jeste generiše se QR kod za pristup bez naplate</w:t>
+            </w:r>
+          </w:p>
+        </w:tc>
+      </w:tr>
+      <w:tr>
+        <w:trPr>
+          <w:trHeight w:val="565"/>
+        </w:trPr>
+        <w:tc>
+          <w:tcPr>
+            <w:tcW w:w="4675" w:type="dxa"/>
+            <w:tcBorders>
+              <w:top w:val="single" w:sz="4" w:space="0" w:color="BEBEBE"/>
+              <w:bottom w:val="single" w:sz="4" w:space="0" w:color="BEBEBE"/>
+              <w:right w:val="single" w:sz="4" w:space="0" w:color="BEBEBE"/>
+            </w:tcBorders>
+          </w:tcPr>
+          <w:p>
+            <w:pPr>
+              <w:pStyle w:val="TableParagraph"/>
+              <w:spacing w:before="135"/>
+              <w:ind w:left="1654"/>
+              <w:rPr>
+                <w:sz w:val="24"/>
+                <w:szCs w:val="24"/>
+              </w:rPr>
+            </w:pPr>
+          </w:p>
+        </w:tc>
+        <w:tc>
+          <w:tcPr>
+            <w:tcW w:w="4238" w:type="dxa"/>
+            <w:tcBorders>
+              <w:top w:val="single" w:sz="4" w:space="0" w:color="BEBEBE"/>
+              <w:left w:val="single" w:sz="4" w:space="0" w:color="BEBEBE"/>
+              <w:bottom w:val="single" w:sz="4" w:space="0" w:color="BEBEBE"/>
+            </w:tcBorders>
+          </w:tcPr>
+          <w:p>
+            <w:pPr>
+              <w:pStyle w:val="TableParagraph"/>
+              <w:numPr>
+                <w:ilvl w:val="0"/>
+                <w:numId w:val="39"/>
+              </w:numPr>
+              <w:rPr>
+                <w:sz w:val="24"/>
+                <w:szCs w:val="24"/>
+              </w:rPr>
+            </w:pPr>
+            <w:r>
+              <w:rPr>
+                <w:sz w:val="24"/>
+                <w:szCs w:val="24"/>
+              </w:rPr>
+              <w:t>Slanje QR koda korisniku putem E-maila</w:t>
+            </w:r>
+          </w:p>
+        </w:tc>
+      </w:tr>
+      <w:tr>
+        <w:trPr>
+          <w:trHeight w:val="565"/>
+        </w:trPr>
+        <w:tc>
+          <w:tcPr>
+            <w:tcW w:w="4675" w:type="dxa"/>
+            <w:tcBorders>
+              <w:top w:val="single" w:sz="4" w:space="0" w:color="BEBEBE"/>
+              <w:bottom w:val="single" w:sz="4" w:space="0" w:color="BEBEBE"/>
+              <w:right w:val="single" w:sz="4" w:space="0" w:color="BEBEBE"/>
+            </w:tcBorders>
+          </w:tcPr>
+          <w:p>
+            <w:pPr>
+              <w:pStyle w:val="TableParagraph"/>
+              <w:numPr>
+                <w:ilvl w:val="0"/>
+                <w:numId w:val="39"/>
+              </w:numPr>
+              <w:spacing w:before="135"/>
+              <w:rPr>
+                <w:sz w:val="24"/>
+                <w:szCs w:val="24"/>
+              </w:rPr>
+            </w:pPr>
+            <w:r>
+              <w:rPr>
+                <w:sz w:val="24"/>
+                <w:szCs w:val="24"/>
+              </w:rPr>
+              <w:t>Pristup parkingu sa QR kodom</w:t>
+            </w:r>
+          </w:p>
+        </w:tc>
+        <w:tc>
+          <w:tcPr>
+            <w:tcW w:w="4238" w:type="dxa"/>
+            <w:tcBorders>
+              <w:top w:val="single" w:sz="4" w:space="0" w:color="BEBEBE"/>
+              <w:left w:val="single" w:sz="4" w:space="0" w:color="BEBEBE"/>
+              <w:bottom w:val="single" w:sz="4" w:space="0" w:color="BEBEBE"/>
+            </w:tcBorders>
+          </w:tcPr>
+          <w:p>
+            <w:pPr>
+              <w:pStyle w:val="TableParagraph"/>
+              <w:ind w:left="1654"/>
+              <w:rPr>
+                <w:sz w:val="24"/>
+                <w:szCs w:val="24"/>
+              </w:rPr>
+            </w:pPr>
+          </w:p>
+        </w:tc>
+      </w:tr>
+      <w:tr>
+        <w:trPr>
+          <w:trHeight w:val="565"/>
+        </w:trPr>
+        <w:tc>
+          <w:tcPr>
+            <w:tcW w:w="4675" w:type="dxa"/>
+            <w:tcBorders>
+              <w:top w:val="single" w:sz="4" w:space="0" w:color="BEBEBE"/>
+              <w:bottom w:val="single" w:sz="4" w:space="0" w:color="BEBEBE"/>
+              <w:right w:val="single" w:sz="4" w:space="0" w:color="BEBEBE"/>
+            </w:tcBorders>
+          </w:tcPr>
+          <w:p>
+            <w:pPr>
+              <w:pStyle w:val="TableParagraph"/>
+              <w:spacing w:before="135"/>
+              <w:ind w:left="1654"/>
+              <w:rPr>
+                <w:sz w:val="24"/>
+                <w:szCs w:val="24"/>
+              </w:rPr>
+            </w:pPr>
+          </w:p>
+        </w:tc>
+        <w:tc>
+          <w:tcPr>
+            <w:tcW w:w="4238" w:type="dxa"/>
+            <w:tcBorders>
+              <w:top w:val="single" w:sz="4" w:space="0" w:color="BEBEBE"/>
+              <w:left w:val="single" w:sz="4" w:space="0" w:color="BEBEBE"/>
+              <w:bottom w:val="single" w:sz="4" w:space="0" w:color="BEBEBE"/>
+            </w:tcBorders>
+          </w:tcPr>
+          <w:p>
+            <w:pPr>
+              <w:pStyle w:val="TableParagraph"/>
+              <w:numPr>
+                <w:ilvl w:val="0"/>
+                <w:numId w:val="39"/>
+              </w:numPr>
+              <w:rPr>
+                <w:sz w:val="24"/>
+                <w:szCs w:val="24"/>
+              </w:rPr>
+            </w:pPr>
+            <w:r>
+              <w:rPr>
+                <w:sz w:val="24"/>
+                <w:szCs w:val="24"/>
+              </w:rPr>
+              <w:t>Validacija QR koda na ulaznom uređaju</w:t>
+            </w:r>
+          </w:p>
+        </w:tc>
+      </w:tr>
+    </w:tbl>
+    <w:p>
+      <w:pPr>
+        <w:spacing w:before="160"/>
+        <w:rPr>
+          <w:b/>
+          <w:i/>
+          <w:sz w:val="28"/>
+        </w:rPr>
+      </w:pPr>
+    </w:p>
+    <w:p>
+      <w:pPr>
+        <w:spacing w:before="160"/>
+        <w:rPr>
+          <w:b/>
+          <w:i/>
+          <w:sz w:val="28"/>
+        </w:rPr>
+      </w:pPr>
+    </w:p>
+    <w:p>
+      <w:pPr>
+        <w:spacing w:before="160"/>
+        <w:rPr>
+          <w:b/>
+          <w:i/>
+          <w:sz w:val="28"/>
+        </w:rPr>
+      </w:pPr>
+    </w:p>
+    <w:p>
+      <w:pPr>
         <w:pStyle w:val="Heading2s"/>
       </w:pPr>
       <w:bookmarkStart w:id="14" w:name="[4.2]_Tok_događaja:_Posljedice_-_Neuspje"/>
@@ -14426,7 +14924,7 @@
               <w:pStyle w:val="TableParagraph"/>
               <w:numPr>
                 <w:ilvl w:val="0"/>
-                <w:numId w:val="3"/>
+                <w:numId w:val="40"/>
               </w:numPr>
               <w:spacing w:before="135"/>
               <w:jc w:val="both"/>
@@ -14456,6 +14954,7 @@
           <w:p>
             <w:pPr>
               <w:pStyle w:val="TableParagraph"/>
+              <w:ind w:left="827"/>
               <w:jc w:val="both"/>
               <w:rPr>
                 <w:sz w:val="24"/>
@@ -14482,6 +14981,7 @@
             <w:pPr>
               <w:pStyle w:val="TableParagraph"/>
               <w:spacing w:before="3"/>
+              <w:ind w:left="827"/>
               <w:jc w:val="both"/>
               <w:rPr>
                 <w:b/>
@@ -14517,18 +15017,22 @@
           <w:p>
             <w:pPr>
               <w:pStyle w:val="TableParagraph"/>
-              <w:jc w:val="both"/>
-              <w:rPr>
-                <w:sz w:val="24"/>
-                <w:szCs w:val="24"/>
-              </w:rPr>
-            </w:pPr>
-            <w:r>
-              <w:rPr>
-                <w:sz w:val="24"/>
-                <w:szCs w:val="24"/>
-              </w:rPr>
-              <w:t>2. Valid</w:t>
+              <w:numPr>
+                <w:ilvl w:val="0"/>
+                <w:numId w:val="40"/>
+              </w:numPr>
+              <w:jc w:val="both"/>
+              <w:rPr>
+                <w:sz w:val="24"/>
+                <w:szCs w:val="24"/>
+              </w:rPr>
+            </w:pPr>
+            <w:r>
+              <w:rPr>
+                <w:sz w:val="24"/>
+                <w:szCs w:val="24"/>
+              </w:rPr>
+              <w:t>Valid</w:t>
             </w:r>
             <w:r>
               <w:rPr>
@@ -14565,74 +15069,6 @@
               </w:rPr>
               <w:t>za plaćanje</w:t>
             </w:r>
-          </w:p>
-        </w:tc>
-      </w:tr>
-      <w:tr>
-        <w:trPr>
-          <w:trHeight w:val="271"/>
-        </w:trPr>
-        <w:tc>
-          <w:tcPr>
-            <w:tcW w:w="4675" w:type="dxa"/>
-            <w:tcBorders>
-              <w:top w:val="single" w:sz="4" w:space="0" w:color="BEBEBE"/>
-              <w:bottom w:val="single" w:sz="4" w:space="0" w:color="BEBEBE"/>
-              <w:right w:val="single" w:sz="4" w:space="0" w:color="BEBEBE"/>
-            </w:tcBorders>
-          </w:tcPr>
-          <w:p>
-            <w:pPr>
-              <w:pStyle w:val="TableParagraph"/>
-              <w:spacing w:before="117" w:line="242" w:lineRule="auto"/>
-              <w:ind w:left="607" w:right="198" w:hanging="356"/>
-              <w:jc w:val="both"/>
-              <w:rPr>
-                <w:sz w:val="24"/>
-                <w:szCs w:val="24"/>
-              </w:rPr>
-            </w:pPr>
-            <w:r>
-              <w:rPr>
-                <w:sz w:val="24"/>
-                <w:szCs w:val="24"/>
-              </w:rPr>
-              <w:t>3. Po</w:t>
-            </w:r>
-            <w:r>
-              <w:rPr>
-                <w:sz w:val="24"/>
-                <w:szCs w:val="24"/>
-              </w:rPr>
-              <w:t xml:space="preserve">tvrđuje </w:t>
-            </w:r>
-            <w:r>
-              <w:rPr>
-                <w:sz w:val="24"/>
-                <w:szCs w:val="24"/>
-              </w:rPr>
-              <w:t>plaćanje</w:t>
-            </w:r>
-          </w:p>
-        </w:tc>
-        <w:tc>
-          <w:tcPr>
-            <w:tcW w:w="4238" w:type="dxa"/>
-            <w:tcBorders>
-              <w:top w:val="single" w:sz="4" w:space="0" w:color="BEBEBE"/>
-              <w:left w:val="single" w:sz="4" w:space="0" w:color="BEBEBE"/>
-              <w:bottom w:val="single" w:sz="4" w:space="0" w:color="BEBEBE"/>
-            </w:tcBorders>
-          </w:tcPr>
-          <w:p>
-            <w:pPr>
-              <w:pStyle w:val="TableParagraph"/>
-              <w:jc w:val="both"/>
-              <w:rPr>
-                <w:sz w:val="24"/>
-                <w:szCs w:val="24"/>
-              </w:rPr>
-            </w:pPr>
           </w:p>
         </w:tc>
       </w:tr>
@@ -14653,7 +15089,7 @@
             <w:pPr>
               <w:pStyle w:val="TableParagraph"/>
               <w:spacing w:before="159"/>
-              <w:ind w:left="251"/>
+              <w:ind w:left="827"/>
               <w:jc w:val="both"/>
               <w:rPr>
                 <w:sz w:val="24"/>
@@ -14674,19 +15110,16 @@
           <w:p>
             <w:pPr>
               <w:pStyle w:val="TableParagraph"/>
-              <w:jc w:val="both"/>
-              <w:rPr>
-                <w:sz w:val="24"/>
-                <w:szCs w:val="24"/>
-              </w:rPr>
-            </w:pPr>
-            <w:r>
-              <w:rPr>
-                <w:sz w:val="24"/>
-                <w:szCs w:val="24"/>
-              </w:rPr>
-              <w:t xml:space="preserve">4. </w:t>
-            </w:r>
+              <w:numPr>
+                <w:ilvl w:val="0"/>
+                <w:numId w:val="40"/>
+              </w:numPr>
+              <w:jc w:val="both"/>
+              <w:rPr>
+                <w:sz w:val="24"/>
+                <w:szCs w:val="24"/>
+              </w:rPr>
+            </w:pPr>
             <w:r>
               <w:rPr>
                 <w:sz w:val="24"/>
@@ -14755,6 +15188,7 @@
           <w:p>
             <w:pPr>
               <w:pStyle w:val="TableParagraph"/>
+              <w:ind w:left="827"/>
               <w:jc w:val="both"/>
               <w:rPr>
                 <w:sz w:val="24"/>
@@ -14775,19 +15209,16 @@
           <w:p>
             <w:pPr>
               <w:pStyle w:val="TableParagraph"/>
-              <w:jc w:val="both"/>
-              <w:rPr>
-                <w:sz w:val="24"/>
-                <w:szCs w:val="24"/>
-              </w:rPr>
-            </w:pPr>
-            <w:r>
-              <w:rPr>
-                <w:sz w:val="24"/>
-                <w:szCs w:val="24"/>
-              </w:rPr>
-              <w:t xml:space="preserve">5. </w:t>
-            </w:r>
+              <w:numPr>
+                <w:ilvl w:val="0"/>
+                <w:numId w:val="40"/>
+              </w:numPr>
+              <w:jc w:val="both"/>
+              <w:rPr>
+                <w:sz w:val="24"/>
+                <w:szCs w:val="24"/>
+              </w:rPr>
+            </w:pPr>
             <w:r>
               <w:rPr>
                 <w:sz w:val="24"/>
@@ -14822,7 +15253,7 @@
             <w:pPr>
               <w:pStyle w:val="TableParagraph"/>
               <w:spacing w:before="69" w:line="242" w:lineRule="auto"/>
-              <w:ind w:left="612" w:right="260" w:hanging="361"/>
+              <w:ind w:left="827" w:right="260"/>
               <w:jc w:val="both"/>
               <w:rPr>
                 <w:sz w:val="24"/>
@@ -14842,18 +15273,23 @@
           </w:tcPr>
           <w:p>
             <w:pPr>
-              <w:jc w:val="both"/>
-              <w:rPr>
-                <w:sz w:val="24"/>
-                <w:szCs w:val="24"/>
-              </w:rPr>
-            </w:pPr>
-            <w:r>
-              <w:rPr>
-                <w:sz w:val="24"/>
-                <w:szCs w:val="24"/>
-              </w:rPr>
-              <w:t>6. Omogućavanje ponovnog unosa podataka za plaćanje</w:t>
+              <w:pStyle w:val="ListParagraph"/>
+              <w:numPr>
+                <w:ilvl w:val="0"/>
+                <w:numId w:val="40"/>
+              </w:numPr>
+              <w:jc w:val="both"/>
+              <w:rPr>
+                <w:sz w:val="24"/>
+                <w:szCs w:val="24"/>
+              </w:rPr>
+            </w:pPr>
+            <w:r>
+              <w:rPr>
+                <w:sz w:val="24"/>
+                <w:szCs w:val="24"/>
+              </w:rPr>
+              <w:t>Omogućavanje ponovnog unosa podataka za plaćanje</w:t>
             </w:r>
           </w:p>
         </w:tc>
@@ -21253,7 +21689,7 @@
               <w:rPr>
                 <w:noProof/>
               </w:rPr>
-              <w:t>18</w:t>
+              <w:t>19</w:t>
             </w:r>
           </w:fldSimple>
         </w:p>
@@ -21321,7 +21757,7 @@
               <w:rPr>
                 <w:noProof/>
               </w:rPr>
-              <w:t>19</w:t>
+              <w:t>20</w:t>
             </w:r>
           </w:fldSimple>
         </w:p>
@@ -21389,7 +21825,7 @@
               <w:rPr>
                 <w:noProof/>
               </w:rPr>
-              <w:t>20</w:t>
+              <w:t>21</w:t>
             </w:r>
           </w:fldSimple>
         </w:p>
@@ -21457,7 +21893,7 @@
               <w:rPr>
                 <w:noProof/>
               </w:rPr>
-              <w:t>21</w:t>
+              <w:t>22</w:t>
             </w:r>
           </w:fldSimple>
         </w:p>
@@ -21866,7 +22302,7 @@
               <w:rPr>
                 <w:noProof/>
               </w:rPr>
-              <w:t>13</w:t>
+              <w:t>16</w:t>
             </w:r>
           </w:fldSimple>
         </w:p>
@@ -21934,7 +22370,7 @@
               <w:rPr>
                 <w:noProof/>
               </w:rPr>
-              <w:t>16</w:t>
+              <w:t>17</w:t>
             </w:r>
           </w:fldSimple>
         </w:p>
@@ -22002,7 +22438,7 @@
               <w:rPr>
                 <w:noProof/>
               </w:rPr>
-              <w:t>17</w:t>
+              <w:t>18</w:t>
             </w:r>
           </w:fldSimple>
         </w:p>
@@ -24328,6 +24764,95 @@
     </w:lvl>
   </w:abstractNum>
   <w:abstractNum w:abstractNumId="22">
+    <w:nsid w:val="3D774AD1"/>
+    <w:multiLevelType w:val="hybridMultilevel"/>
+    <w:tmpl w:val="3FF406D6"/>
+    <w:lvl w:ilvl="0" w:tplc="A8706234">
+      <w:start w:val="1"/>
+      <w:numFmt w:val="decimal"/>
+      <w:lvlText w:val="%1."/>
+      <w:lvlJc w:val="left"/>
+      <w:pPr>
+        <w:ind w:left="1654" w:hanging="360"/>
+      </w:pPr>
+      <w:rPr>
+        <w:rFonts w:hint="default"/>
+      </w:rPr>
+    </w:lvl>
+    <w:lvl w:ilvl="1" w:tplc="04090019" w:tentative="1">
+      <w:start w:val="1"/>
+      <w:numFmt w:val="lowerLetter"/>
+      <w:lvlText w:val="%2."/>
+      <w:lvlJc w:val="left"/>
+      <w:pPr>
+        <w:ind w:left="2267" w:hanging="360"/>
+      </w:pPr>
+    </w:lvl>
+    <w:lvl w:ilvl="2" w:tplc="0409001B" w:tentative="1">
+      <w:start w:val="1"/>
+      <w:numFmt w:val="lowerRoman"/>
+      <w:lvlText w:val="%3."/>
+      <w:lvlJc w:val="right"/>
+      <w:pPr>
+        <w:ind w:left="2987" w:hanging="180"/>
+      </w:pPr>
+    </w:lvl>
+    <w:lvl w:ilvl="3" w:tplc="0409000F" w:tentative="1">
+      <w:start w:val="1"/>
+      <w:numFmt w:val="decimal"/>
+      <w:lvlText w:val="%4."/>
+      <w:lvlJc w:val="left"/>
+      <w:pPr>
+        <w:ind w:left="3707" w:hanging="360"/>
+      </w:pPr>
+    </w:lvl>
+    <w:lvl w:ilvl="4" w:tplc="04090019" w:tentative="1">
+      <w:start w:val="1"/>
+      <w:numFmt w:val="lowerLetter"/>
+      <w:lvlText w:val="%5."/>
+      <w:lvlJc w:val="left"/>
+      <w:pPr>
+        <w:ind w:left="4427" w:hanging="360"/>
+      </w:pPr>
+    </w:lvl>
+    <w:lvl w:ilvl="5" w:tplc="0409001B" w:tentative="1">
+      <w:start w:val="1"/>
+      <w:numFmt w:val="lowerRoman"/>
+      <w:lvlText w:val="%6."/>
+      <w:lvlJc w:val="right"/>
+      <w:pPr>
+        <w:ind w:left="5147" w:hanging="180"/>
+      </w:pPr>
+    </w:lvl>
+    <w:lvl w:ilvl="6" w:tplc="0409000F" w:tentative="1">
+      <w:start w:val="1"/>
+      <w:numFmt w:val="decimal"/>
+      <w:lvlText w:val="%7."/>
+      <w:lvlJc w:val="left"/>
+      <w:pPr>
+        <w:ind w:left="5867" w:hanging="360"/>
+      </w:pPr>
+    </w:lvl>
+    <w:lvl w:ilvl="7" w:tplc="04090019" w:tentative="1">
+      <w:start w:val="1"/>
+      <w:numFmt w:val="lowerLetter"/>
+      <w:lvlText w:val="%8."/>
+      <w:lvlJc w:val="left"/>
+      <w:pPr>
+        <w:ind w:left="6587" w:hanging="360"/>
+      </w:pPr>
+    </w:lvl>
+    <w:lvl w:ilvl="8" w:tplc="0409001B" w:tentative="1">
+      <w:start w:val="1"/>
+      <w:numFmt w:val="lowerRoman"/>
+      <w:lvlText w:val="%9."/>
+      <w:lvlJc w:val="right"/>
+      <w:pPr>
+        <w:ind w:left="7307" w:hanging="180"/>
+      </w:pPr>
+    </w:lvl>
+  </w:abstractNum>
+  <w:abstractNum w:abstractNumId="23">
     <w:nsid w:val="41C72A78"/>
     <w:multiLevelType w:val="hybridMultilevel"/>
     <w:tmpl w:val="FC7E30B0"/>
@@ -24449,7 +24974,7 @@
       </w:rPr>
     </w:lvl>
   </w:abstractNum>
-  <w:abstractNum w:abstractNumId="23">
+  <w:abstractNum w:abstractNumId="24">
     <w:nsid w:val="41E94490"/>
     <w:multiLevelType w:val="hybridMultilevel"/>
     <w:tmpl w:val="20CA482A"/>
@@ -24571,7 +25096,7 @@
       </w:rPr>
     </w:lvl>
   </w:abstractNum>
-  <w:abstractNum w:abstractNumId="24">
+  <w:abstractNum w:abstractNumId="25">
     <w:nsid w:val="480939C8"/>
     <w:multiLevelType w:val="hybridMultilevel"/>
     <w:tmpl w:val="E5CA3CF2"/>
@@ -24693,7 +25218,7 @@
       </w:rPr>
     </w:lvl>
   </w:abstractNum>
-  <w:abstractNum w:abstractNumId="25">
+  <w:abstractNum w:abstractNumId="26">
     <w:nsid w:val="484C94E2"/>
     <w:multiLevelType w:val="hybridMultilevel"/>
     <w:tmpl w:val="7DD6130A"/>
@@ -24779,7 +25304,7 @@
       </w:pPr>
     </w:lvl>
   </w:abstractNum>
-  <w:abstractNum w:abstractNumId="26">
+  <w:abstractNum w:abstractNumId="27">
     <w:nsid w:val="4A0737CC"/>
     <w:multiLevelType w:val="hybridMultilevel"/>
     <w:tmpl w:val="917A7DDA"/>
@@ -24901,7 +25426,7 @@
       </w:rPr>
     </w:lvl>
   </w:abstractNum>
-  <w:abstractNum w:abstractNumId="27">
+  <w:abstractNum w:abstractNumId="28">
     <w:nsid w:val="557B08DD"/>
     <w:multiLevelType w:val="hybridMultilevel"/>
     <w:tmpl w:val="667C3F34"/>
@@ -25023,7 +25548,7 @@
       </w:rPr>
     </w:lvl>
   </w:abstractNum>
-  <w:abstractNum w:abstractNumId="28">
+  <w:abstractNum w:abstractNumId="29">
     <w:nsid w:val="5582371F"/>
     <w:multiLevelType w:val="hybridMultilevel"/>
     <w:tmpl w:val="A9186860"/>
@@ -25145,7 +25670,7 @@
       </w:rPr>
     </w:lvl>
   </w:abstractNum>
-  <w:abstractNum w:abstractNumId="29">
+  <w:abstractNum w:abstractNumId="30">
     <w:nsid w:val="56331E51"/>
     <w:multiLevelType w:val="hybridMultilevel"/>
     <w:tmpl w:val="5D0642D6"/>
@@ -25267,7 +25792,96 @@
       </w:rPr>
     </w:lvl>
   </w:abstractNum>
-  <w:abstractNum w:abstractNumId="30">
+  <w:abstractNum w:abstractNumId="31">
+    <w:nsid w:val="5E83062D"/>
+    <w:multiLevelType w:val="hybridMultilevel"/>
+    <w:tmpl w:val="32E874A2"/>
+    <w:lvl w:ilvl="0" w:tplc="A8706234">
+      <w:start w:val="1"/>
+      <w:numFmt w:val="decimal"/>
+      <w:lvlText w:val="%1."/>
+      <w:lvlJc w:val="left"/>
+      <w:pPr>
+        <w:ind w:left="827" w:hanging="360"/>
+      </w:pPr>
+      <w:rPr>
+        <w:rFonts w:hint="default"/>
+      </w:rPr>
+    </w:lvl>
+    <w:lvl w:ilvl="1" w:tplc="04090019" w:tentative="1">
+      <w:start w:val="1"/>
+      <w:numFmt w:val="lowerLetter"/>
+      <w:lvlText w:val="%2."/>
+      <w:lvlJc w:val="left"/>
+      <w:pPr>
+        <w:ind w:left="1440" w:hanging="360"/>
+      </w:pPr>
+    </w:lvl>
+    <w:lvl w:ilvl="2" w:tplc="0409001B" w:tentative="1">
+      <w:start w:val="1"/>
+      <w:numFmt w:val="lowerRoman"/>
+      <w:lvlText w:val="%3."/>
+      <w:lvlJc w:val="right"/>
+      <w:pPr>
+        <w:ind w:left="2160" w:hanging="180"/>
+      </w:pPr>
+    </w:lvl>
+    <w:lvl w:ilvl="3" w:tplc="0409000F" w:tentative="1">
+      <w:start w:val="1"/>
+      <w:numFmt w:val="decimal"/>
+      <w:lvlText w:val="%4."/>
+      <w:lvlJc w:val="left"/>
+      <w:pPr>
+        <w:ind w:left="2880" w:hanging="360"/>
+      </w:pPr>
+    </w:lvl>
+    <w:lvl w:ilvl="4" w:tplc="04090019" w:tentative="1">
+      <w:start w:val="1"/>
+      <w:numFmt w:val="lowerLetter"/>
+      <w:lvlText w:val="%5."/>
+      <w:lvlJc w:val="left"/>
+      <w:pPr>
+        <w:ind w:left="3600" w:hanging="360"/>
+      </w:pPr>
+    </w:lvl>
+    <w:lvl w:ilvl="5" w:tplc="0409001B" w:tentative="1">
+      <w:start w:val="1"/>
+      <w:numFmt w:val="lowerRoman"/>
+      <w:lvlText w:val="%6."/>
+      <w:lvlJc w:val="right"/>
+      <w:pPr>
+        <w:ind w:left="4320" w:hanging="180"/>
+      </w:pPr>
+    </w:lvl>
+    <w:lvl w:ilvl="6" w:tplc="0409000F" w:tentative="1">
+      <w:start w:val="1"/>
+      <w:numFmt w:val="decimal"/>
+      <w:lvlText w:val="%7."/>
+      <w:lvlJc w:val="left"/>
+      <w:pPr>
+        <w:ind w:left="5040" w:hanging="360"/>
+      </w:pPr>
+    </w:lvl>
+    <w:lvl w:ilvl="7" w:tplc="04090019" w:tentative="1">
+      <w:start w:val="1"/>
+      <w:numFmt w:val="lowerLetter"/>
+      <w:lvlText w:val="%8."/>
+      <w:lvlJc w:val="left"/>
+      <w:pPr>
+        <w:ind w:left="5760" w:hanging="360"/>
+      </w:pPr>
+    </w:lvl>
+    <w:lvl w:ilvl="8" w:tplc="0409001B" w:tentative="1">
+      <w:start w:val="1"/>
+      <w:numFmt w:val="lowerRoman"/>
+      <w:lvlText w:val="%9."/>
+      <w:lvlJc w:val="right"/>
+      <w:pPr>
+        <w:ind w:left="6480" w:hanging="180"/>
+      </w:pPr>
+    </w:lvl>
+  </w:abstractNum>
+  <w:abstractNum w:abstractNumId="32">
     <w:nsid w:val="60F31E89"/>
     <w:multiLevelType w:val="hybridMultilevel"/>
     <w:tmpl w:val="2B244A80"/>
@@ -25356,7 +25970,7 @@
       </w:pPr>
     </w:lvl>
   </w:abstractNum>
-  <w:abstractNum w:abstractNumId="31">
+  <w:abstractNum w:abstractNumId="33">
     <w:nsid w:val="61A7215A"/>
     <w:multiLevelType w:val="hybridMultilevel"/>
     <w:tmpl w:val="4F3E6144"/>
@@ -25445,7 +26059,7 @@
       </w:pPr>
     </w:lvl>
   </w:abstractNum>
-  <w:abstractNum w:abstractNumId="32">
+  <w:abstractNum w:abstractNumId="34">
     <w:nsid w:val="65497EA7"/>
     <w:multiLevelType w:val="hybridMultilevel"/>
     <w:tmpl w:val="473A127A"/>
@@ -25566,7 +26180,7 @@
       </w:rPr>
     </w:lvl>
   </w:abstractNum>
-  <w:abstractNum w:abstractNumId="33">
+  <w:abstractNum w:abstractNumId="35">
     <w:nsid w:val="680D0DD5"/>
     <w:multiLevelType w:val="hybridMultilevel"/>
     <w:tmpl w:val="B20292BC"/>
@@ -25687,7 +26301,7 @@
       </w:rPr>
     </w:lvl>
   </w:abstractNum>
-  <w:abstractNum w:abstractNumId="34">
+  <w:abstractNum w:abstractNumId="36">
     <w:nsid w:val="6BAE3CCD"/>
     <w:multiLevelType w:val="hybridMultilevel"/>
     <w:tmpl w:val="A3686BC4"/>
@@ -25808,7 +26422,7 @@
       </w:rPr>
     </w:lvl>
   </w:abstractNum>
-  <w:abstractNum w:abstractNumId="35">
+  <w:abstractNum w:abstractNumId="37">
     <w:nsid w:val="738D72EB"/>
     <w:multiLevelType w:val="hybridMultilevel"/>
     <w:tmpl w:val="0FCC53B4"/>
@@ -25921,7 +26535,7 @@
       </w:rPr>
     </w:lvl>
   </w:abstractNum>
-  <w:abstractNum w:abstractNumId="36">
+  <w:abstractNum w:abstractNumId="38">
     <w:nsid w:val="75CB2D7E"/>
     <w:multiLevelType w:val="hybridMultilevel"/>
     <w:tmpl w:val="0598E056"/>
@@ -26007,7 +26621,7 @@
       </w:pPr>
     </w:lvl>
   </w:abstractNum>
-  <w:abstractNum w:abstractNumId="37">
+  <w:abstractNum w:abstractNumId="39">
     <w:nsid w:val="760614CD"/>
     <w:multiLevelType w:val="hybridMultilevel"/>
     <w:tmpl w:val="85B622AA"/>
@@ -26109,7 +26723,7 @@
     <w:abstractNumId w:val="4"/>
   </w:num>
   <w:num w:numId="5">
-    <w:abstractNumId w:val="35"/>
+    <w:abstractNumId w:val="37"/>
   </w:num>
   <w:num w:numId="6">
     <w:abstractNumId w:val="14"/>
@@ -26118,7 +26732,7 @@
     <w:abstractNumId w:val="10"/>
   </w:num>
   <w:num w:numId="8">
-    <w:abstractNumId w:val="25"/>
+    <w:abstractNumId w:val="26"/>
   </w:num>
   <w:num w:numId="9">
     <w:abstractNumId w:val="8"/>
@@ -26127,19 +26741,19 @@
     <w:abstractNumId w:val="7"/>
   </w:num>
   <w:num w:numId="11">
-    <w:abstractNumId w:val="28"/>
+    <w:abstractNumId w:val="29"/>
   </w:num>
   <w:num w:numId="12">
     <w:abstractNumId w:val="5"/>
   </w:num>
   <w:num w:numId="13">
-    <w:abstractNumId w:val="24"/>
+    <w:abstractNumId w:val="25"/>
   </w:num>
   <w:num w:numId="14">
-    <w:abstractNumId w:val="32"/>
+    <w:abstractNumId w:val="34"/>
   </w:num>
   <w:num w:numId="15">
-    <w:abstractNumId w:val="27"/>
+    <w:abstractNumId w:val="28"/>
   </w:num>
   <w:num w:numId="16">
     <w:abstractNumId w:val="16"/>
@@ -26160,25 +26774,25 @@
     <w:abstractNumId w:val="13"/>
   </w:num>
   <w:num w:numId="22">
-    <w:abstractNumId w:val="23"/>
+    <w:abstractNumId w:val="24"/>
   </w:num>
   <w:num w:numId="23">
     <w:abstractNumId w:val="12"/>
   </w:num>
   <w:num w:numId="24">
-    <w:abstractNumId w:val="33"/>
+    <w:abstractNumId w:val="35"/>
   </w:num>
   <w:num w:numId="25">
-    <w:abstractNumId w:val="22"/>
+    <w:abstractNumId w:val="23"/>
   </w:num>
   <w:num w:numId="26">
-    <w:abstractNumId w:val="26"/>
+    <w:abstractNumId w:val="27"/>
   </w:num>
   <w:num w:numId="27">
-    <w:abstractNumId w:val="34"/>
+    <w:abstractNumId w:val="36"/>
   </w:num>
   <w:num w:numId="28">
-    <w:abstractNumId w:val="29"/>
+    <w:abstractNumId w:val="30"/>
   </w:num>
   <w:num w:numId="29">
     <w:abstractNumId w:val="1"/>
@@ -26187,22 +26801,22 @@
     <w:abstractNumId w:val="19"/>
   </w:num>
   <w:num w:numId="31">
-    <w:abstractNumId w:val="36"/>
+    <w:abstractNumId w:val="38"/>
   </w:num>
   <w:num w:numId="32">
     <w:abstractNumId w:val="17"/>
   </w:num>
   <w:num w:numId="33">
-    <w:abstractNumId w:val="30"/>
+    <w:abstractNumId w:val="32"/>
   </w:num>
   <w:num w:numId="34">
     <w:abstractNumId w:val="18"/>
   </w:num>
   <w:num w:numId="35">
-    <w:abstractNumId w:val="37"/>
+    <w:abstractNumId w:val="39"/>
   </w:num>
   <w:num w:numId="36">
-    <w:abstractNumId w:val="31"/>
+    <w:abstractNumId w:val="33"/>
   </w:num>
   <w:num w:numId="37">
     <w:abstractNumId w:val="9"/>
@@ -26210,7 +26824,13 @@
   <w:num w:numId="38">
     <w:abstractNumId w:val="11"/>
   </w:num>
-  <w:numIdMacAtCleanup w:val="38"/>
+  <w:num w:numId="39">
+    <w:abstractNumId w:val="22"/>
+  </w:num>
+  <w:num w:numId="40">
+    <w:abstractNumId w:val="31"/>
+  </w:num>
+  <w:numIdMacAtCleanup w:val="40"/>
 </w:numbering>
 </file>
 

</xml_diff>